<commit_message>
feat(cypress): create e2e for sales-flow
</commit_message>
<xml_diff>
--- a/docs/DVP.docx
+++ b/docs/DVP.docx
@@ -138,7 +138,6 @@
           <w:szCs w:val="56"/>
         </w:rPr>
       </w:pPr>
-      <w:proofErr w:type="spellStart"/>
       <w:r>
         <w:rPr>
           <w:b/>
@@ -147,7 +146,6 @@
         </w:rPr>
         <w:t>ImoX</w:t>
       </w:r>
-      <w:proofErr w:type="spellEnd"/>
     </w:p>
     <w:p>
       <w:pPr>
@@ -561,7 +559,6 @@
                 <w:sz w:val="24"/>
               </w:rPr>
             </w:pPr>
-            <w:proofErr w:type="gramStart"/>
             <w:r>
               <w:rPr>
                 <w:rFonts w:cs="Arial"/>
@@ -574,15 +571,7 @@
                 <w:rFonts w:cs="Arial"/>
                 <w:sz w:val="24"/>
               </w:rPr>
-              <w:t xml:space="preserve">  -</w:t>
-            </w:r>
-            <w:proofErr w:type="gramEnd"/>
-            <w:r>
-              <w:rPr>
-                <w:rFonts w:cs="Arial"/>
-                <w:sz w:val="24"/>
-              </w:rPr>
-              <w:t xml:space="preserve"> Interno</w:t>
+              <w:t xml:space="preserve">  - Interno</w:t>
             </w:r>
           </w:p>
         </w:tc>
@@ -655,7 +644,6 @@
               </w:rPr>
               <w:t xml:space="preserve">: </w:t>
             </w:r>
-            <w:proofErr w:type="spellStart"/>
             <w:r>
               <w:rPr>
                 <w:i/>
@@ -673,7 +661,6 @@
               </w:rPr>
               <w:t>moX</w:t>
             </w:r>
-            <w:proofErr w:type="spellEnd"/>
           </w:p>
         </w:tc>
       </w:tr>
@@ -728,7 +715,7 @@
                 <w:rFonts w:cs="Arial"/>
                 <w:sz w:val="24"/>
               </w:rPr>
-              <w:t>05</w:t>
+              <w:t>28</w:t>
             </w:r>
             <w:r>
               <w:rPr>
@@ -737,13 +724,12 @@
               </w:rPr>
               <w:t xml:space="preserve"> de </w:t>
             </w:r>
-            <w:proofErr w:type="gramStart"/>
             <w:r>
               <w:rPr>
                 <w:rFonts w:cs="Arial"/>
                 <w:sz w:val="24"/>
               </w:rPr>
-              <w:t>março</w:t>
+              <w:t>setembro</w:t>
             </w:r>
             <w:r>
               <w:rPr>
@@ -757,22 +743,14 @@
                 <w:rFonts w:cs="Arial"/>
                 <w:sz w:val="24"/>
               </w:rPr>
-              <w:t xml:space="preserve"> de</w:t>
-            </w:r>
-            <w:proofErr w:type="gramEnd"/>
-            <w:r>
-              <w:rPr>
-                <w:rFonts w:cs="Arial"/>
-                <w:sz w:val="24"/>
-              </w:rPr>
-              <w:t xml:space="preserve"> 201</w:t>
+              <w:t xml:space="preserve"> de 20</w:t>
             </w:r>
             <w:r>
               <w:rPr>
                 <w:rFonts w:cs="Arial"/>
                 <w:sz w:val="24"/>
               </w:rPr>
-              <w:t>1</w:t>
+              <w:t>25</w:t>
             </w:r>
           </w:p>
         </w:tc>
@@ -826,7 +804,7 @@
                 <w:bCs/>
                 <w:lang w:val="en-US"/>
               </w:rPr>
-              <w:t>Alex Marcolongo</w:t>
+              <w:t>Samuel AssisBazone</w:t>
             </w:r>
           </w:p>
           <w:p>
@@ -1656,17 +1634,7 @@
         <w:jc w:val="both"/>
       </w:pPr>
       <w:r>
-        <w:t>- Diagrama de Casos de Uso - Sistema de Gerenciamento de Clientes (diagrama-casos-uso-</w:t>
-      </w:r>
-      <w:proofErr w:type="spellStart"/>
-      <w:proofErr w:type="gramStart"/>
-      <w:r>
-        <w:t>simples.puml</w:t>
-      </w:r>
-      <w:proofErr w:type="spellEnd"/>
-      <w:proofErr w:type="gramEnd"/>
-      <w:r>
-        <w:t>)</w:t>
+        <w:t>- Diagrama de Casos de Uso - Sistema de Gerenciamento de Clientes (diagrama-casos-uso-simples.puml)</w:t>
       </w:r>
     </w:p>
     <w:p>
@@ -1675,17 +1643,7 @@
         <w:jc w:val="both"/>
       </w:pPr>
       <w:r>
-        <w:t>- Diagrama de Classes de Implementação (diagrama-classes-</w:t>
-      </w:r>
-      <w:proofErr w:type="spellStart"/>
-      <w:proofErr w:type="gramStart"/>
-      <w:r>
-        <w:t>implementacao.puml</w:t>
-      </w:r>
-      <w:proofErr w:type="spellEnd"/>
-      <w:proofErr w:type="gramEnd"/>
-      <w:r>
-        <w:t>)</w:t>
+        <w:t>- Diagrama de Classes de Implementação (diagrama-classes-implementacao.puml)</w:t>
       </w:r>
     </w:p>
     <w:p>
@@ -1697,17 +1655,7 @@
         <w:t xml:space="preserve">   </w:t>
       </w:r>
       <w:r>
-        <w:t>- Diagrama de Sequência de Fluxos (diagrama-sequencia-</w:t>
-      </w:r>
-      <w:proofErr w:type="spellStart"/>
-      <w:proofErr w:type="gramStart"/>
-      <w:r>
-        <w:t>fluxos.puml</w:t>
-      </w:r>
-      <w:proofErr w:type="spellEnd"/>
-      <w:proofErr w:type="gramEnd"/>
-      <w:r>
-        <w:t>)</w:t>
+        <w:t>- Diagrama de Sequência de Fluxos (diagrama-sequencia-fluxos.puml)</w:t>
       </w:r>
     </w:p>
     <w:p>
@@ -1944,15 +1892,7 @@
         <w:jc w:val="both"/>
       </w:pPr>
       <w:r>
-        <w:t xml:space="preserve">Controlar os livros presentes no acervo da biblioteca e entrada de </w:t>
-      </w:r>
-      <w:proofErr w:type="gramStart"/>
-      <w:r>
-        <w:t>novos  livros</w:t>
-      </w:r>
-      <w:proofErr w:type="gramEnd"/>
-      <w:r>
-        <w:t>.</w:t>
+        <w:t>Controlar os livros presentes no acervo da biblioteca e entrada de novos  livros.</w:t>
       </w:r>
     </w:p>
     <w:p>
@@ -2100,15 +2040,7 @@
         <w:jc w:val="both"/>
       </w:pPr>
       <w:r>
-        <w:t xml:space="preserve">Sistema do módulo da </w:t>
-      </w:r>
-      <w:proofErr w:type="gramStart"/>
-      <w:r>
-        <w:t>biblioteca ,</w:t>
-      </w:r>
-      <w:proofErr w:type="gramEnd"/>
-      <w:r>
-        <w:t xml:space="preserve"> etapa 1, implementado de acordo com a especificação feita na fase de análise. (código objeto e código fonte).</w:t>
+        <w:t>Sistema do módulo da biblioteca , etapa 1, implementado de acordo com a especificação feita na fase de análise. (código objeto e código fonte).</w:t>
       </w:r>
     </w:p>
     <w:p>
@@ -2314,11 +2246,9 @@
       <w:r>
         <w:t xml:space="preserve">Utilizar linguagem </w:t>
       </w:r>
-      <w:proofErr w:type="spellStart"/>
       <w:r>
         <w:t>NodeJS</w:t>
       </w:r>
-      <w:proofErr w:type="spellEnd"/>
     </w:p>
     <w:p>
       <w:pPr>
@@ -2326,13 +2256,8 @@
         <w:jc w:val="both"/>
       </w:pPr>
       <w:r>
-        <w:t xml:space="preserve">Utilizar o banco de dados </w:t>
-      </w:r>
-      <w:proofErr w:type="spellStart"/>
-      <w:r>
-        <w:t>PostGreSQL</w:t>
-      </w:r>
-      <w:proofErr w:type="spellEnd"/>
+        <w:t>Utilizar o banco de dados PostGreSQL</w:t>
+      </w:r>
     </w:p>
     <w:p>
       <w:pPr>
@@ -2340,23 +2265,7 @@
         <w:jc w:val="both"/>
       </w:pPr>
       <w:r>
-        <w:t xml:space="preserve">A arquitetura da solução </w:t>
-      </w:r>
-      <w:proofErr w:type="spellStart"/>
-      <w:r>
-        <w:t>obdecer</w:t>
-      </w:r>
-      <w:proofErr w:type="spellEnd"/>
-      <w:r>
-        <w:t xml:space="preserve"> o design </w:t>
-      </w:r>
-      <w:proofErr w:type="spellStart"/>
-      <w:r>
-        <w:t>pattern</w:t>
-      </w:r>
-      <w:proofErr w:type="spellEnd"/>
-      <w:r>
-        <w:t xml:space="preserve"> MVC.</w:t>
+        <w:t>A arquitetura da solução obdecer o design pattern MVC.</w:t>
       </w:r>
     </w:p>
     <w:p>
@@ -2494,15 +2403,7 @@
         <w:jc w:val="both"/>
       </w:pPr>
       <w:r>
-        <w:t xml:space="preserve">- O sistema será desenvolvido utilizando tecnologias web modernas (Node.js, HTML5, CSS3, </w:t>
-      </w:r>
-      <w:proofErr w:type="spellStart"/>
-      <w:r>
-        <w:t>JavaScript</w:t>
-      </w:r>
-      <w:proofErr w:type="spellEnd"/>
-      <w:r>
-        <w:t>)</w:t>
+        <w:t>- O sistema será desenvolvido utilizando tecnologias web modernas (Node.js, HTML5, CSS3, JavaScript)</w:t>
       </w:r>
     </w:p>
     <w:p>
@@ -2651,76 +2552,12 @@
           <w:highlight w:val="lightGray"/>
         </w:rPr>
       </w:pPr>
-      <w:proofErr w:type="spellStart"/>
       <w:r>
         <w:rPr>
           <w:highlight w:val="lightGray"/>
         </w:rPr>
         <w:lastRenderedPageBreak/>
-        <w:t>Rodinei</w:t>
-      </w:r>
-      <w:proofErr w:type="spellEnd"/>
-      <w:r>
-        <w:rPr>
-          <w:highlight w:val="lightGray"/>
-        </w:rPr>
-        <w:t xml:space="preserve"> </w:t>
-      </w:r>
-      <w:proofErr w:type="spellStart"/>
-      <w:r>
-        <w:rPr>
-          <w:highlight w:val="lightGray"/>
-        </w:rPr>
-        <w:t>Perassol</w:t>
-      </w:r>
-      <w:proofErr w:type="spellEnd"/>
-      <w:r>
-        <w:rPr>
-          <w:highlight w:val="lightGray"/>
-        </w:rPr>
-        <w:t xml:space="preserve"> </w:t>
-      </w:r>
-      <w:proofErr w:type="spellStart"/>
-      <w:r>
-        <w:rPr>
-          <w:highlight w:val="lightGray"/>
-        </w:rPr>
-        <w:t>Isquierdo</w:t>
-      </w:r>
-      <w:proofErr w:type="spellEnd"/>
-      <w:r>
-        <w:rPr>
-          <w:highlight w:val="lightGray"/>
-        </w:rPr>
-        <w:t xml:space="preserve">: diretor da </w:t>
-      </w:r>
-      <w:proofErr w:type="spellStart"/>
-      <w:r>
-        <w:rPr>
-          <w:highlight w:val="lightGray"/>
-        </w:rPr>
-        <w:t>Houter</w:t>
-      </w:r>
-      <w:proofErr w:type="spellEnd"/>
-      <w:r>
-        <w:rPr>
-          <w:highlight w:val="lightGray"/>
-        </w:rPr>
-        <w:t xml:space="preserve"> e patrocinador do projeto. Interessado em minimizar o custo operacional de atendimento da </w:t>
-      </w:r>
-      <w:proofErr w:type="spellStart"/>
-      <w:r>
-        <w:rPr>
-          <w:highlight w:val="lightGray"/>
-        </w:rPr>
-        <w:t>Houter</w:t>
-      </w:r>
-      <w:proofErr w:type="spellEnd"/>
-      <w:r>
-        <w:rPr>
-          <w:highlight w:val="lightGray"/>
-        </w:rPr>
-        <w:t>, assim como, acompanhar a tendência dos seus concorrentes.</w:t>
+        <w:t>Rodinei Perassol Isquierdo: diretor da Houter e patrocinador do projeto. Interessado em minimizar o custo operacional de atendimento da Houter, assim como, acompanhar a tendência dos seus concorrentes.</w:t>
       </w:r>
     </w:p>
     <w:p>
@@ -2738,21 +2575,7 @@
         <w:rPr>
           <w:highlight w:val="lightGray"/>
         </w:rPr>
-        <w:t xml:space="preserve">Pedro Mendes Junior: gerente de marketing da </w:t>
-      </w:r>
-      <w:proofErr w:type="spellStart"/>
-      <w:r>
-        <w:rPr>
-          <w:highlight w:val="lightGray"/>
-        </w:rPr>
-        <w:t>Houter</w:t>
-      </w:r>
-      <w:proofErr w:type="spellEnd"/>
-      <w:r>
-        <w:rPr>
-          <w:highlight w:val="lightGray"/>
-        </w:rPr>
-        <w:t xml:space="preserve"> e da Premium. Interessado em expandir os canais de comunicação com os clientes, assim como, fixar a marca de ambas as empresas como inovadoras no Vale do Paraíba em termos de tecnologia.</w:t>
+        <w:t>Pedro Mendes Junior: gerente de marketing da Houter e da Premium. Interessado em expandir os canais de comunicação com os clientes, assim como, fixar a marca de ambas as empresas como inovadoras no Vale do Paraíba em termos de tecnologia.</w:t>
       </w:r>
     </w:p>
     <w:p>
@@ -2802,19 +2625,11 @@
           <w:highlight w:val="lightGray"/>
         </w:rPr>
       </w:pPr>
-      <w:proofErr w:type="spellStart"/>
       <w:r>
         <w:rPr>
           <w:highlight w:val="lightGray"/>
         </w:rPr>
-        <w:t>ClickNow</w:t>
-      </w:r>
-      <w:proofErr w:type="spellEnd"/>
-      <w:r>
-        <w:rPr>
-          <w:highlight w:val="lightGray"/>
-        </w:rPr>
-        <w:t>: empresa responsável pela especificação da navegabilidade, definição do design, definição do conteúdo, desenvolvimento do site estático e campanhas de marketing do e-Commerce.</w:t>
+        <w:t>ClickNow: empresa responsável pela especificação da navegabilidade, definição do design, definição do conteúdo, desenvolvimento do site estático e campanhas de marketing do e-Commerce.</w:t>
       </w:r>
     </w:p>
     <w:p/>
@@ -2864,25 +2679,7 @@
           <w:sz w:val="22"/>
           <w:szCs w:val="22"/>
         </w:rPr>
-        <w:t xml:space="preserve">Os sistemas serão desenvolvidos tendo como base a arquitetura ilustrada na Figura 1. Toda a arquitetura será baseada nos padrões de projetos tradicionais do </w:t>
-      </w:r>
-      <w:proofErr w:type="spellStart"/>
-      <w:r>
-        <w:rPr>
-          <w:rFonts w:cs="Arial"/>
-          <w:sz w:val="22"/>
-          <w:szCs w:val="22"/>
-        </w:rPr>
-        <w:t>GoF</w:t>
-      </w:r>
-      <w:proofErr w:type="spellEnd"/>
-      <w:r>
-        <w:rPr>
-          <w:rFonts w:cs="Arial"/>
-          <w:sz w:val="22"/>
-          <w:szCs w:val="22"/>
-        </w:rPr>
-        <w:t xml:space="preserve"> e também nos padrões J2EE sendo executados dentro de um Servidor de Aplicações.</w:t>
+        <w:t>Os sistemas serão desenvolvidos tendo como base a arquitetura ilustrada na Figura 1. Toda a arquitetura será baseada nos padrões de projetos tradicionais do GoF e também nos padrões J2EE sendo executados dentro de um Servidor de Aplicações.</w:t>
       </w:r>
     </w:p>
     <w:p>
@@ -3000,79 +2797,75 @@
           <w:sz w:val="22"/>
           <w:szCs w:val="22"/>
         </w:rPr>
-        <w:t xml:space="preserve">As Classes de Domínio são as classes que representam os </w:t>
-      </w:r>
-      <w:proofErr w:type="spellStart"/>
-      <w:r>
+        <w:t>As Classes de Domínio são as classes que representam os Value Object, contendo somente os atributos e os métodos getters/setters.</w:t>
+      </w:r>
+    </w:p>
+    <w:p>
+      <w:pPr>
+        <w:pStyle w:val="Corpodetexto"/>
+        <w:ind w:left="360" w:firstLine="349"/>
+        <w:jc w:val="both"/>
         <w:rPr>
           <w:rFonts w:cs="Arial"/>
           <w:sz w:val="22"/>
           <w:szCs w:val="22"/>
         </w:rPr>
-        <w:t>Value</w:t>
-      </w:r>
-      <w:proofErr w:type="spellEnd"/>
+      </w:pPr>
       <w:r>
         <w:rPr>
           <w:rFonts w:cs="Arial"/>
           <w:sz w:val="22"/>
           <w:szCs w:val="22"/>
         </w:rPr>
-        <w:t xml:space="preserve"> </w:t>
-      </w:r>
-      <w:proofErr w:type="spellStart"/>
+        <w:t>As Classes de Negócio representam as classes responsáveis por aplicar as</w:t>
+      </w:r>
       <w:r>
         <w:rPr>
           <w:rFonts w:cs="Arial"/>
           <w:sz w:val="22"/>
           <w:szCs w:val="22"/>
         </w:rPr>
-        <w:t>Object</w:t>
-      </w:r>
-      <w:proofErr w:type="spellEnd"/>
+        <w:t xml:space="preserve"> </w:t>
+      </w:r>
       <w:r>
         <w:rPr>
           <w:rFonts w:cs="Arial"/>
           <w:sz w:val="22"/>
           <w:szCs w:val="22"/>
         </w:rPr>
-        <w:t xml:space="preserve">, contendo somente os atributos e os métodos </w:t>
-      </w:r>
-      <w:proofErr w:type="spellStart"/>
+        <w:t>regras de negócio do sistema como, por exemplo, Cadastrar Comarca. Constarão</w:t>
+      </w:r>
       <w:r>
         <w:rPr>
           <w:rFonts w:cs="Arial"/>
           <w:sz w:val="22"/>
           <w:szCs w:val="22"/>
         </w:rPr>
-        <w:t>getters</w:t>
-      </w:r>
-      <w:proofErr w:type="spellEnd"/>
+        <w:t xml:space="preserve"> </w:t>
+      </w:r>
       <w:r>
         <w:rPr>
           <w:rFonts w:cs="Arial"/>
           <w:sz w:val="22"/>
           <w:szCs w:val="22"/>
         </w:rPr>
-        <w:t>/</w:t>
-      </w:r>
-      <w:proofErr w:type="spellStart"/>
+        <w:t>também nas classes de negócio o relacionamento com os DAOs responsáveis por</w:t>
+      </w:r>
       <w:r>
         <w:rPr>
           <w:rFonts w:cs="Arial"/>
           <w:sz w:val="22"/>
           <w:szCs w:val="22"/>
         </w:rPr>
-        <w:t>setters</w:t>
-      </w:r>
-      <w:proofErr w:type="spellEnd"/>
+        <w:t xml:space="preserve"> </w:t>
+      </w:r>
       <w:r>
         <w:rPr>
           <w:rFonts w:cs="Arial"/>
           <w:sz w:val="22"/>
           <w:szCs w:val="22"/>
         </w:rPr>
-        <w:t>.</w:t>
+        <w:t>persistir e recuperar os objetos no banco de dados.</w:t>
       </w:r>
     </w:p>
     <w:p>
@@ -3092,7 +2885,8 @@
           <w:sz w:val="22"/>
           <w:szCs w:val="22"/>
         </w:rPr>
-        <w:t>As Classes de Negócio representam as classes responsáveis por aplicar as</w:t>
+        <w:lastRenderedPageBreak/>
+        <w:t>No Container EJB constarão os componentes de software principais da</w:t>
       </w:r>
       <w:r>
         <w:rPr>
@@ -3108,112 +2902,7 @@
           <w:sz w:val="22"/>
           <w:szCs w:val="22"/>
         </w:rPr>
-        <w:t>regras de negócio do sistema como, por exemplo, Cadastrar Comarca. Constarão</w:t>
-      </w:r>
-      <w:r>
-        <w:rPr>
-          <w:rFonts w:cs="Arial"/>
-          <w:sz w:val="22"/>
-          <w:szCs w:val="22"/>
-        </w:rPr>
-        <w:t xml:space="preserve"> </w:t>
-      </w:r>
-      <w:r>
-        <w:rPr>
-          <w:rFonts w:cs="Arial"/>
-          <w:sz w:val="22"/>
-          <w:szCs w:val="22"/>
-        </w:rPr>
-        <w:t xml:space="preserve">também nas classes de negócio o relacionamento com os </w:t>
-      </w:r>
-      <w:proofErr w:type="spellStart"/>
-      <w:r>
-        <w:rPr>
-          <w:rFonts w:cs="Arial"/>
-          <w:sz w:val="22"/>
-          <w:szCs w:val="22"/>
-        </w:rPr>
-        <w:t>DAOs</w:t>
-      </w:r>
-      <w:proofErr w:type="spellEnd"/>
-      <w:r>
-        <w:rPr>
-          <w:rFonts w:cs="Arial"/>
-          <w:sz w:val="22"/>
-          <w:szCs w:val="22"/>
-        </w:rPr>
-        <w:t xml:space="preserve"> responsáveis por</w:t>
-      </w:r>
-      <w:r>
-        <w:rPr>
-          <w:rFonts w:cs="Arial"/>
-          <w:sz w:val="22"/>
-          <w:szCs w:val="22"/>
-        </w:rPr>
-        <w:t xml:space="preserve"> </w:t>
-      </w:r>
-      <w:r>
-        <w:rPr>
-          <w:rFonts w:cs="Arial"/>
-          <w:sz w:val="22"/>
-          <w:szCs w:val="22"/>
-        </w:rPr>
-        <w:t>persistir e recuperar os objetos no banco de dados.</w:t>
-      </w:r>
-    </w:p>
-    <w:p>
-      <w:pPr>
-        <w:pStyle w:val="Corpodetexto"/>
-        <w:ind w:left="360" w:firstLine="349"/>
-        <w:jc w:val="both"/>
-        <w:rPr>
-          <w:rFonts w:cs="Arial"/>
-          <w:sz w:val="22"/>
-          <w:szCs w:val="22"/>
-        </w:rPr>
-      </w:pPr>
-      <w:r>
-        <w:rPr>
-          <w:rFonts w:cs="Arial"/>
-          <w:sz w:val="22"/>
-          <w:szCs w:val="22"/>
-        </w:rPr>
-        <w:lastRenderedPageBreak/>
-        <w:t>No Container EJB constarão os componentes de software principais da</w:t>
-      </w:r>
-      <w:r>
-        <w:rPr>
-          <w:rFonts w:cs="Arial"/>
-          <w:sz w:val="22"/>
-          <w:szCs w:val="22"/>
-        </w:rPr>
-        <w:t xml:space="preserve"> </w:t>
-      </w:r>
-      <w:r>
-        <w:rPr>
-          <w:rFonts w:cs="Arial"/>
-          <w:sz w:val="22"/>
-          <w:szCs w:val="22"/>
-        </w:rPr>
-        <w:t xml:space="preserve">arquitetura J2EE como </w:t>
-      </w:r>
-      <w:proofErr w:type="spellStart"/>
-      <w:r>
-        <w:rPr>
-          <w:rFonts w:cs="Arial"/>
-          <w:sz w:val="22"/>
-          <w:szCs w:val="22"/>
-        </w:rPr>
-        <w:t>Session</w:t>
-      </w:r>
-      <w:proofErr w:type="spellEnd"/>
-      <w:r>
-        <w:rPr>
-          <w:rFonts w:cs="Arial"/>
-          <w:sz w:val="22"/>
-          <w:szCs w:val="22"/>
-        </w:rPr>
-        <w:t xml:space="preserve"> Beans. Para esta arquitetura de software, será</w:t>
+        <w:t>arquitetura J2EE como Session Beans. Para esta arquitetura de software, será</w:t>
       </w:r>
       <w:r>
         <w:rPr>
@@ -3419,7 +3108,7 @@
           <v:shape id="_x0000_i1025" type="#_x0000_t75" style="width:6in;height:6in" o:ole="">
             <v:imagedata r:id="rId20" o:title=""/>
           </v:shape>
-          <o:OLEObject Type="Embed" ProgID="Photoshop.Image.11" ShapeID="_x0000_i1025" DrawAspect="Content" ObjectID="_1820585635" r:id="rId21">
+          <o:OLEObject Type="Embed" ProgID="Photoshop.Image.11" ShapeID="_x0000_i1025" DrawAspect="Content" ObjectID="_1820694818" r:id="rId21">
             <o:FieldCodes>\s</o:FieldCodes>
           </o:OLEObject>
         </w:object>
@@ -3496,8 +3185,6 @@
         </w:rPr>
         <w:t xml:space="preserve">em importar para a aplicação o pacote </w:t>
       </w:r>
-      <w:proofErr w:type="spellStart"/>
-      <w:proofErr w:type="gramStart"/>
       <w:r>
         <w:rPr>
           <w:rFonts w:cs="Arial"/>
@@ -3510,8 +3197,6 @@
         </w:rPr>
         <w:t>br.com.aluy.arq.ejb.command</w:t>
       </w:r>
-      <w:proofErr w:type="spellEnd"/>
-      <w:proofErr w:type="gramEnd"/>
       <w:r>
         <w:rPr>
           <w:rFonts w:cs="Arial"/>
@@ -3545,8 +3230,6 @@
         <w:lastRenderedPageBreak/>
         <w:t xml:space="preserve">importar o pacote </w:t>
       </w:r>
-      <w:proofErr w:type="spellStart"/>
-      <w:proofErr w:type="gramStart"/>
       <w:r>
         <w:rPr>
           <w:rFonts w:cs="Arial"/>
@@ -3571,8 +3254,6 @@
         </w:rPr>
         <w:t>.arq.command</w:t>
       </w:r>
-      <w:proofErr w:type="spellEnd"/>
-      <w:proofErr w:type="gramEnd"/>
       <w:r>
         <w:rPr>
           <w:rFonts w:cs="Arial"/>
@@ -3648,15 +3329,7 @@
         <w:ind w:left="567"/>
       </w:pPr>
       <w:r>
-        <w:t xml:space="preserve">• Utilização do Node.js como </w:t>
-      </w:r>
-      <w:proofErr w:type="spellStart"/>
-      <w:r>
-        <w:t>runtime</w:t>
-      </w:r>
-      <w:proofErr w:type="spellEnd"/>
-      <w:r>
-        <w:t xml:space="preserve"> principal;</w:t>
+        <w:t>• Utilização do Node.js como runtime principal;</w:t>
       </w:r>
     </w:p>
     <w:p>
@@ -3672,23 +3345,7 @@
         <w:ind w:left="567"/>
       </w:pPr>
       <w:r>
-        <w:t xml:space="preserve">• Utilização de HTML5, CSS3 e </w:t>
-      </w:r>
-      <w:proofErr w:type="spellStart"/>
-      <w:r>
-        <w:t>JavaScript</w:t>
-      </w:r>
-      <w:proofErr w:type="spellEnd"/>
-      <w:r>
-        <w:t xml:space="preserve"> </w:t>
-      </w:r>
-      <w:proofErr w:type="spellStart"/>
-      <w:r>
-        <w:t>vanilla</w:t>
-      </w:r>
-      <w:proofErr w:type="spellEnd"/>
-      <w:r>
-        <w:t xml:space="preserve"> para desenvolvimento da camada de apresentação;</w:t>
+        <w:t>• Utilização de HTML5, CSS3 e JavaScript vanilla para desenvolvimento da camada de apresentação;</w:t>
       </w:r>
     </w:p>
     <w:p>
@@ -3720,15 +3377,7 @@
         <w:ind w:left="567"/>
       </w:pPr>
       <w:r>
-        <w:t xml:space="preserve">• Arquitetura </w:t>
-      </w:r>
-      <w:proofErr w:type="spellStart"/>
-      <w:r>
-        <w:t>RESTful</w:t>
-      </w:r>
-      <w:proofErr w:type="spellEnd"/>
-      <w:r>
-        <w:t xml:space="preserve"> para APIs;</w:t>
+        <w:t>• Arquitetura RESTful para APIs;</w:t>
       </w:r>
     </w:p>
     <w:p>
@@ -3736,15 +3385,7 @@
         <w:ind w:left="567"/>
       </w:pPr>
       <w:r>
-        <w:t xml:space="preserve">• Implementação de validação de dados com </w:t>
-      </w:r>
-      <w:proofErr w:type="spellStart"/>
-      <w:r>
-        <w:t>Joi</w:t>
-      </w:r>
-      <w:proofErr w:type="spellEnd"/>
-      <w:r>
-        <w:t>.</w:t>
+        <w:t>• Implementação de validação de dados com Joi.</w:t>
       </w:r>
     </w:p>
     <w:p/>
@@ -3897,23 +3538,7 @@
           <w:sz w:val="20"/>
           <w:szCs w:val="20"/>
         </w:rPr>
-        <w:t xml:space="preserve">• Considerar a utilização de software livre e open </w:t>
-      </w:r>
-      <w:proofErr w:type="spellStart"/>
-      <w:r>
-        <w:rPr>
-          <w:sz w:val="20"/>
-          <w:szCs w:val="20"/>
-        </w:rPr>
-        <w:t>source</w:t>
-      </w:r>
-      <w:proofErr w:type="spellEnd"/>
-      <w:r>
-        <w:rPr>
-          <w:sz w:val="20"/>
-          <w:szCs w:val="20"/>
-        </w:rPr>
-        <w:t>, quando possível</w:t>
+        <w:t>• Considerar a utilização de software livre e open source, quando possível</w:t>
       </w:r>
     </w:p>
     <w:p>
@@ -4012,23 +3637,7 @@
         <w:jc w:val="both"/>
       </w:pPr>
       <w:r>
-        <w:t xml:space="preserve">Esta seção apresenta os Casos de Uso </w:t>
-      </w:r>
-      <w:proofErr w:type="spellStart"/>
-      <w:r>
-        <w:t>arquiteturalmente</w:t>
-      </w:r>
-      <w:proofErr w:type="spellEnd"/>
-      <w:r>
-        <w:t xml:space="preserve"> significativos, que foram selecionados considerando-se o pacote do Modelo de Casos de Uso que representa o sistema </w:t>
-      </w:r>
-      <w:proofErr w:type="spellStart"/>
-      <w:r>
-        <w:t>xxxxx</w:t>
-      </w:r>
-      <w:proofErr w:type="spellEnd"/>
-      <w:r>
-        <w:t>.</w:t>
+        <w:t>Esta seção apresenta os Casos de Uso arquiteturalmente significativos, que foram selecionados considerando-se o pacote do Modelo de Casos de Uso que representa o sistema xxxxx.</w:t>
       </w:r>
     </w:p>
     <w:p>
@@ -4177,6 +3786,7 @@
       </w:pPr>
       <w:r>
         <w:rPr>
+          <w:noProof/>
           <w:sz w:val="18"/>
           <w:szCs w:val="18"/>
         </w:rPr>
@@ -4300,23 +3910,7 @@
           <w:sz w:val="28"/>
           <w:szCs w:val="28"/>
         </w:rPr>
-        <w:t xml:space="preserve">Descrição dos Casos de Uso </w:t>
-      </w:r>
-      <w:proofErr w:type="spellStart"/>
-      <w:r>
-        <w:rPr>
-          <w:sz w:val="28"/>
-          <w:szCs w:val="28"/>
-        </w:rPr>
-        <w:t>Arquiteturalmente</w:t>
-      </w:r>
-      <w:proofErr w:type="spellEnd"/>
-      <w:r>
-        <w:rPr>
-          <w:sz w:val="28"/>
-          <w:szCs w:val="28"/>
-        </w:rPr>
-        <w:t xml:space="preserve"> Significativos</w:t>
+        <w:t>Descrição dos Casos de Uso Arquiteturalmente Significativos</w:t>
       </w:r>
       <w:bookmarkEnd w:id="52"/>
       <w:bookmarkEnd w:id="53"/>
@@ -4347,15 +3941,7 @@
         <w:ind w:left="709"/>
       </w:pPr>
       <w:r>
-        <w:t xml:space="preserve">Este caso de uso se inicia quando o usuário (Administrador ou Funcionário) solicita operações de manutenção (incluir, alterar, consultar, inativar) nos dados de clientes. Inclui validações automáticas de dados, CPF e </w:t>
-      </w:r>
-      <w:proofErr w:type="spellStart"/>
-      <w:r>
-        <w:t>email</w:t>
-      </w:r>
-      <w:proofErr w:type="spellEnd"/>
-      <w:r>
-        <w:t>.</w:t>
+        <w:t>Este caso de uso se inicia quando o usuário (Administrador ou Funcionário) solicita operações de manutenção (incluir, alterar, consultar, inativar) nos dados de clientes. Inclui validações automáticas de dados, CPF e email.</w:t>
       </w:r>
     </w:p>
     <w:p>
@@ -4676,55 +4262,7 @@
         <w:jc w:val="both"/>
       </w:pPr>
       <w:r>
-        <w:t xml:space="preserve">Neste momento, é importante ressaltar que a camada de apresentação envolve componentes que são executados na porção servidora e na porção cliente. Na porção servidora, são executados os componentes que montam as páginas </w:t>
-      </w:r>
-      <w:proofErr w:type="spellStart"/>
-      <w:r>
-        <w:t>html</w:t>
-      </w:r>
-      <w:proofErr w:type="spellEnd"/>
-      <w:r>
-        <w:t>/</w:t>
-      </w:r>
-      <w:proofErr w:type="spellStart"/>
-      <w:r>
-        <w:t>jsp</w:t>
-      </w:r>
-      <w:proofErr w:type="spellEnd"/>
-      <w:r>
-        <w:t xml:space="preserve"> de resposta e controlam o fluxo de interação com o usuário. Assim, envolve interpretação de páginas </w:t>
-      </w:r>
-      <w:proofErr w:type="spellStart"/>
-      <w:r>
-        <w:t>jsp</w:t>
-      </w:r>
-      <w:proofErr w:type="spellEnd"/>
-      <w:r>
-        <w:t xml:space="preserve">, utilização de </w:t>
-      </w:r>
-      <w:proofErr w:type="spellStart"/>
-      <w:r>
-        <w:t>helpers</w:t>
-      </w:r>
-      <w:proofErr w:type="spellEnd"/>
-      <w:r>
-        <w:t xml:space="preserve"> para montagem das páginas de resposta, delegação de solicitação para a camada de negócio, obtenção de respostas da camada de negócio, dentre outros. Já na porção cliente, estão os códigos </w:t>
-      </w:r>
-      <w:proofErr w:type="spellStart"/>
-      <w:r>
-        <w:t>javascript</w:t>
-      </w:r>
-      <w:proofErr w:type="spellEnd"/>
-      <w:r>
-        <w:t xml:space="preserve"> que são executados nos navegadores dos usuários com o intuito de facilitar a interação. Por exemplo, podem fazer uma pré-verificação dos dados digitados (como o preenchimento de campos obrigatórios), solicitação de páginas via </w:t>
-      </w:r>
-      <w:proofErr w:type="spellStart"/>
-      <w:r>
-        <w:t>ajax</w:t>
-      </w:r>
-      <w:proofErr w:type="spellEnd"/>
-      <w:r>
-        <w:t>, de modo a tornar mais dinâmica a interação com o usuário, dentre outros.</w:t>
+        <w:t>Neste momento, é importante ressaltar que a camada de apresentação envolve componentes que são executados na porção servidora e na porção cliente. Na porção servidora, são executados os componentes que montam as páginas html/jsp de resposta e controlam o fluxo de interação com o usuário. Assim, envolve interpretação de páginas jsp, utilização de helpers para montagem das páginas de resposta, delegação de solicitação para a camada de negócio, obtenção de respostas da camada de negócio, dentre outros. Já na porção cliente, estão os códigos javascript que são executados nos navegadores dos usuários com o intuito de facilitar a interação. Por exemplo, podem fazer uma pré-verificação dos dados digitados (como o preenchimento de campos obrigatórios), solicitação de páginas via ajax, de modo a tornar mais dinâmica a interação com o usuário, dentre outros.</w:t>
       </w:r>
     </w:p>
     <w:p>
@@ -4805,32 +4343,7 @@
           <w:sz w:val="16"/>
           <w:szCs w:val="16"/>
         </w:rPr>
-        <w:t xml:space="preserve">5.2: Camadas do </w:t>
-      </w:r>
-      <w:proofErr w:type="spellStart"/>
-      <w:proofErr w:type="gramStart"/>
-      <w:r>
-        <w:rPr>
-          <w:sz w:val="16"/>
-          <w:szCs w:val="16"/>
-        </w:rPr>
-        <w:t>xxx</w:t>
-      </w:r>
-      <w:proofErr w:type="spellEnd"/>
-      <w:r>
-        <w:rPr>
-          <w:sz w:val="16"/>
-          <w:szCs w:val="16"/>
-        </w:rPr>
-        <w:t xml:space="preserve">  com</w:t>
-      </w:r>
-      <w:proofErr w:type="gramEnd"/>
-      <w:r>
-        <w:rPr>
-          <w:sz w:val="16"/>
-          <w:szCs w:val="16"/>
-        </w:rPr>
-        <w:t xml:space="preserve"> as dependências de tecnologia</w:t>
+        <w:t>5.2: Camadas do xxx  com as dependências de tecnologia</w:t>
       </w:r>
     </w:p>
     <w:p/>
@@ -4863,39 +4376,7 @@
         <w:jc w:val="both"/>
       </w:pPr>
       <w:r>
-        <w:t xml:space="preserve">Nesta camada, temos o pacote </w:t>
-      </w:r>
-      <w:proofErr w:type="spellStart"/>
-      <w:r>
-        <w:t>form</w:t>
-      </w:r>
-      <w:proofErr w:type="spellEnd"/>
-      <w:r>
-        <w:t xml:space="preserve"> que contém todos os arquivos relacionados à exibição de informações para usuário, o que engloba páginas JSP e HTML, imagens, </w:t>
-      </w:r>
-      <w:proofErr w:type="spellStart"/>
-      <w:r>
-        <w:t>javascript</w:t>
-      </w:r>
-      <w:proofErr w:type="spellEnd"/>
-      <w:r>
-        <w:t xml:space="preserve">, dentre outros. Já o pacote de controle desta camada, contém as </w:t>
-      </w:r>
-      <w:proofErr w:type="spellStart"/>
-      <w:r>
-        <w:t>Actions</w:t>
-      </w:r>
-      <w:proofErr w:type="spellEnd"/>
-      <w:r>
-        <w:t xml:space="preserve"> do </w:t>
-      </w:r>
-      <w:proofErr w:type="spellStart"/>
-      <w:r>
-        <w:t>Struts</w:t>
-      </w:r>
-      <w:proofErr w:type="spellEnd"/>
-      <w:r>
-        <w:t xml:space="preserve"> responsáveis pela comunicação com as classes da camada de negócio. Estes pacotes podem ser vistos na </w:t>
+        <w:t xml:space="preserve">Nesta camada, temos o pacote form que contém todos os arquivos relacionados à exibição de informações para usuário, o que engloba páginas JSP e HTML, imagens, javascript, dentre outros. Já o pacote de controle desta camada, contém as Actions do Struts responsáveis pela comunicação com as classes da camada de negócio. Estes pacotes podem ser vistos na </w:t>
       </w:r>
       <w:r>
         <w:fldChar w:fldCharType="begin"/>
@@ -4927,7 +4408,7 @@
           <v:shape id="_x0000_i1026" type="#_x0000_t75" style="width:314.9pt;height:204.75pt" o:ole="">
             <v:imagedata r:id="rId25" o:title=""/>
           </v:shape>
-          <o:OLEObject Type="Embed" ProgID="Word.Picture.8" ShapeID="_x0000_i1026" DrawAspect="Content" ObjectID="_1820585636" r:id="rId26"/>
+          <o:OLEObject Type="Embed" ProgID="Word.Picture.8" ShapeID="_x0000_i1026" DrawAspect="Content" ObjectID="_1820694819" r:id="rId26"/>
         </w:object>
       </w:r>
     </w:p>
@@ -4992,15 +4473,7 @@
         <w:jc w:val="both"/>
       </w:pPr>
       <w:r>
-        <w:t xml:space="preserve">Nesta camada, temos o pacote controle que contém as classes responsáveis por controlar as regras de negócio da aplicação. O pacote model, contém as classes que representam o modelo, ou seja, aquelas que contém as informações sobre o Sistema XXX. O pacote </w:t>
-      </w:r>
-      <w:proofErr w:type="spellStart"/>
-      <w:r>
-        <w:t>controller</w:t>
-      </w:r>
-      <w:proofErr w:type="spellEnd"/>
-      <w:r>
-        <w:t xml:space="preserve"> contém as classes de controle do negócio. O pacote complementador contém classes que auxiliam na complementação de informações e o pacote filtro contém as classes que auxiliam na filtragem de informações.</w:t>
+        <w:t>Nesta camada, temos o pacote controle que contém as classes responsáveis por controlar as regras de negócio da aplicação. O pacote model, contém as classes que representam o modelo, ou seja, aquelas que contém as informações sobre o Sistema XXX. O pacote controller contém as classes de controle do negócio. O pacote complementador contém classes que auxiliam na complementação de informações e o pacote filtro contém as classes que auxiliam na filtragem de informações.</w:t>
       </w:r>
     </w:p>
     <w:p>
@@ -5017,11 +4490,11 @@
         <w:t>A imagem 4.4 ilustra os pacotes descritos.</w:t>
       </w:r>
     </w:p>
-    <w:bookmarkStart w:id="67" w:name="_MON_1256973328"/>
-    <w:bookmarkStart w:id="68" w:name="_MON_1251188758"/>
+    <w:bookmarkStart w:id="67" w:name="_MON_1251188758"/>
+    <w:bookmarkStart w:id="68" w:name="_MON_1251533293"/>
     <w:bookmarkEnd w:id="67"/>
     <w:bookmarkEnd w:id="68"/>
-    <w:bookmarkStart w:id="69" w:name="_MON_1251533293"/>
+    <w:bookmarkStart w:id="69" w:name="_MON_1256973328"/>
     <w:bookmarkEnd w:id="69"/>
     <w:p>
       <w:pPr>
@@ -5032,7 +4505,7 @@
           <v:shape id="_x0000_i1027" type="#_x0000_t75" style="width:346.85pt;height:208.5pt" o:ole="">
             <v:imagedata r:id="rId27" o:title=""/>
           </v:shape>
-          <o:OLEObject Type="Embed" ProgID="Word.Picture.8" ShapeID="_x0000_i1027" DrawAspect="Content" ObjectID="_1820585637" r:id="rId28"/>
+          <o:OLEObject Type="Embed" ProgID="Word.Picture.8" ShapeID="_x0000_i1027" DrawAspect="Content" ObjectID="_1820694820" r:id="rId28"/>
         </w:object>
       </w:r>
     </w:p>
@@ -5064,15 +4537,10 @@
       <w:bookmarkStart w:id="70" w:name="_Toc177443813"/>
       <w:bookmarkStart w:id="71" w:name="_Toc261999372"/>
       <w:r>
-        <w:t xml:space="preserve">Pacote </w:t>
-      </w:r>
-      <w:proofErr w:type="spellStart"/>
-      <w:r>
-        <w:t>Controller</w:t>
+        <w:t>Pacote Controller</w:t>
       </w:r>
       <w:bookmarkEnd w:id="70"/>
       <w:bookmarkEnd w:id="71"/>
-      <w:proofErr w:type="spellEnd"/>
     </w:p>
     <w:p/>
     <w:p>
@@ -5282,39 +4750,7 @@
         <w:ind w:firstLine="709"/>
       </w:pPr>
       <w:r>
-        <w:t xml:space="preserve">Nesta camada temos o pacote </w:t>
-      </w:r>
-      <w:proofErr w:type="spellStart"/>
-      <w:r>
-        <w:t>dao</w:t>
-      </w:r>
-      <w:proofErr w:type="spellEnd"/>
-      <w:r>
-        <w:t xml:space="preserve"> que contém as classes e interfaces responsáveis por persistir as informações do XXXX no BD relacional. O pacote </w:t>
-      </w:r>
-      <w:proofErr w:type="spellStart"/>
-      <w:r>
-        <w:t>hibernate</w:t>
-      </w:r>
-      <w:proofErr w:type="spellEnd"/>
-      <w:r>
-        <w:t xml:space="preserve"> contido em </w:t>
-      </w:r>
-      <w:proofErr w:type="spellStart"/>
-      <w:r>
-        <w:t>dao</w:t>
-      </w:r>
-      <w:proofErr w:type="spellEnd"/>
-      <w:r>
-        <w:t xml:space="preserve">, possui as classes que dependem diretamente do </w:t>
-      </w:r>
-      <w:proofErr w:type="spellStart"/>
-      <w:r>
-        <w:t>Hibernate</w:t>
-      </w:r>
-      <w:proofErr w:type="spellEnd"/>
-      <w:r>
-        <w:t>, que é o framework utilizado para realizar o mapeamento objeto relacional.</w:t>
+        <w:t>Nesta camada temos o pacote dao que contém as classes e interfaces responsáveis por persistir as informações do XXXX no BD relacional. O pacote hibernate contido em dao, possui as classes que dependem diretamente do Hibernate, que é o framework utilizado para realizar o mapeamento objeto relacional.</w:t>
       </w:r>
     </w:p>
     <w:p>
@@ -5428,6 +4864,9 @@
     <w:p/>
     <w:p>
       <w:r>
+        <w:rPr>
+          <w:noProof/>
+        </w:rPr>
         <w:lastRenderedPageBreak/>
         <w:drawing>
           <wp:inline distT="0" distB="0" distL="0" distR="0" wp14:anchorId="3EE1DB9A" wp14:editId="440E563B">
@@ -5518,15 +4957,7 @@
         <w:jc w:val="both"/>
       </w:pPr>
       <w:r>
-        <w:t xml:space="preserve">Trata-se de uma visão do Modelo de Implantação que, para a configuração em questão, indica os nós físicos (computadores, CPUs), que executarão o subsistema XXXX, e as respectivas interconexões (barramento, LAN, </w:t>
-      </w:r>
-      <w:proofErr w:type="spellStart"/>
-      <w:r>
-        <w:t>etc</w:t>
-      </w:r>
-      <w:proofErr w:type="spellEnd"/>
-      <w:r>
-        <w:t>).  A figura 6 ilustra o modelo de implantação para o XXXX.</w:t>
+        <w:t>Trata-se de uma visão do Modelo de Implantação que, para a configuração em questão, indica os nós físicos (computadores, CPUs), que executarão o subsistema XXXX, e as respectivas interconexões (barramento, LAN, etc).  A figura 6 ilustra o modelo de implantação para o XXXX.</w:t>
       </w:r>
     </w:p>
     <w:p/>
@@ -5623,46 +5054,10 @@
         <w:rPr>
           <w:b/>
         </w:rPr>
-        <w:t xml:space="preserve">Web </w:t>
-      </w:r>
-      <w:proofErr w:type="spellStart"/>
-      <w:r>
-        <w:rPr>
-          <w:b/>
-        </w:rPr>
-        <w:t>Client</w:t>
-      </w:r>
-      <w:proofErr w:type="spellEnd"/>
-      <w:r>
-        <w:rPr>
-          <w:b/>
-        </w:rPr>
-        <w:t xml:space="preserve"> </w:t>
-      </w:r>
-      <w:proofErr w:type="spellStart"/>
-      <w:r>
-        <w:rPr>
-          <w:b/>
-        </w:rPr>
-        <w:t>Application</w:t>
-      </w:r>
-      <w:proofErr w:type="spellEnd"/>
-      <w:r>
-        <w:rPr>
-          <w:b/>
-        </w:rPr>
-        <w:t xml:space="preserve"> (WCA):</w:t>
-      </w:r>
-      <w:r>
-        <w:t xml:space="preserve"> Aplicativos com interface de usuário via navegador, construídos com base no Framework </w:t>
-      </w:r>
-      <w:proofErr w:type="spellStart"/>
-      <w:r>
-        <w:t>Struts</w:t>
-      </w:r>
-      <w:proofErr w:type="spellEnd"/>
-      <w:r>
-        <w:t xml:space="preserve">. </w:t>
+        <w:t>Web Client Application (WCA):</w:t>
+      </w:r>
+      <w:r>
+        <w:t xml:space="preserve"> Aplicativos com interface de usuário via navegador, construídos com base no Framework Struts. </w:t>
       </w:r>
     </w:p>
     <w:p>
@@ -5747,31 +5142,7 @@
         <w:jc w:val="both"/>
       </w:pPr>
       <w:r>
-        <w:t xml:space="preserve">O mecanismo de persistência utilizado no </w:t>
-      </w:r>
-      <w:proofErr w:type="gramStart"/>
-      <w:r>
-        <w:t>sistema  SISCAD</w:t>
-      </w:r>
-      <w:proofErr w:type="gramEnd"/>
-      <w:r>
-        <w:t xml:space="preserve"> utiliza-se o banco de dados Relacional Oracle juntamente com o framework para mapeamento objeto-relacional, </w:t>
-      </w:r>
-      <w:proofErr w:type="spellStart"/>
-      <w:r>
-        <w:t>Hibernate</w:t>
-      </w:r>
-      <w:proofErr w:type="spellEnd"/>
-      <w:r>
-        <w:t xml:space="preserve">. O controle de transações adotado envolve a utilização do Spring Framework em conjunto com o </w:t>
-      </w:r>
-      <w:proofErr w:type="spellStart"/>
-      <w:r>
-        <w:t>Hibernate</w:t>
-      </w:r>
-      <w:proofErr w:type="spellEnd"/>
-      <w:r>
-        <w:t>.</w:t>
+        <w:t>O mecanismo de persistência utilizado no sistema  SISCAD utiliza-se o banco de dados Relacional Oracle juntamente com o framework para mapeamento objeto-relacional, Hibernate. O controle de transações adotado envolve a utilização do Spring Framework em conjunto com o Hibernate.</w:t>
       </w:r>
     </w:p>
     <w:p>
@@ -5862,14 +5233,9 @@
         <w:ind w:firstLine="360"/>
         <w:jc w:val="center"/>
       </w:pPr>
-      <w:proofErr w:type="spellStart"/>
       <w:r>
         <w:lastRenderedPageBreak/>
-        <w:t>Figrua</w:t>
-      </w:r>
-      <w:proofErr w:type="spellEnd"/>
-      <w:r>
-        <w:t xml:space="preserve"> XXX – Modelo Lógico</w:t>
+        <w:t>Figrua XXX – Modelo Lógico</w:t>
       </w:r>
     </w:p>
     <w:p>
@@ -5883,9 +5249,12 @@
         <w:jc w:val="both"/>
       </w:pPr>
       <w:r>
+        <w:rPr>
+          <w:noProof/>
+        </w:rPr>
         <w:lastRenderedPageBreak/>
         <w:drawing>
-          <wp:inline distT="0" distB="0" distL="0" distR="0" wp14:anchorId="5C73DE2E" wp14:editId="2AA034E7">
+          <wp:inline distT="0" distB="0" distL="0" distR="0" wp14:anchorId="5C73DE2E" wp14:editId="665B8B44">
             <wp:extent cx="6840220" cy="8269356"/>
             <wp:effectExtent l="0" t="0" r="0" b="0"/>
             <wp:docPr id="1635486852" name="Imagem 3" descr="Diagrama&#10;&#10;O conteúdo gerado por IA pode estar incorreto."/>
@@ -5951,13 +5320,8 @@
         <w:ind w:firstLine="360"/>
         <w:jc w:val="center"/>
       </w:pPr>
-      <w:proofErr w:type="spellStart"/>
-      <w:r>
-        <w:t>Figrua</w:t>
-      </w:r>
-      <w:proofErr w:type="spellEnd"/>
-      <w:r>
-        <w:t xml:space="preserve"> XXX – Modelo Físico</w:t>
+      <w:r>
+        <w:t>Figrua XXX – Modelo Físico</w:t>
       </w:r>
     </w:p>
     <w:p>
@@ -6397,15 +5761,7 @@
         <w:jc w:val="both"/>
       </w:pPr>
       <w:r>
-        <w:t xml:space="preserve">O sistema XXXX será usado para o controle do comércio exterior e </w:t>
-      </w:r>
-      <w:proofErr w:type="spellStart"/>
-      <w:r>
-        <w:t>conseqüentemente</w:t>
-      </w:r>
-      <w:proofErr w:type="spellEnd"/>
-      <w:r>
-        <w:t xml:space="preserve"> terá uma grande base.</w:t>
+        <w:t>O sistema XXXX será usado para o controle do comércio exterior e conseqüentemente terá uma grande base.</w:t>
       </w:r>
     </w:p>
     <w:p>
@@ -6451,15 +5807,7 @@
         <w:jc w:val="both"/>
       </w:pPr>
       <w:r>
-        <w:t xml:space="preserve">O sistema XXX será usado para o controle do comércio exterior brasileiro, </w:t>
-      </w:r>
-      <w:proofErr w:type="spellStart"/>
-      <w:r>
-        <w:t>conseqüentemente</w:t>
-      </w:r>
-      <w:proofErr w:type="spellEnd"/>
-      <w:r>
-        <w:t xml:space="preserve"> tratando de altos volumes financeiros e um grande número de operações de importação/ exportação diariamente. </w:t>
+        <w:t xml:space="preserve">O sistema XXX será usado para o controle do comércio exterior brasileiro, conseqüentemente tratando de altos volumes financeiros e um grande número de operações de importação/ exportação diariamente. </w:t>
       </w:r>
     </w:p>
     <w:p>
@@ -6485,15 +5833,7 @@
         <w:jc w:val="both"/>
       </w:pPr>
       <w:r>
-        <w:t xml:space="preserve">Adicionalmente, o sistema XXX pode ser alvo de ataques de “hackers” para roubar ou simplesmente corromper informações, possibilidade aumentada pela interface do sistema disponível na Internet, para evitar que tais ataques sejam bem sucedidos uma </w:t>
-      </w:r>
-      <w:proofErr w:type="spellStart"/>
-      <w:r>
-        <w:t>infra-estrutura</w:t>
-      </w:r>
-      <w:proofErr w:type="spellEnd"/>
-      <w:r>
-        <w:t xml:space="preserve"> de segurança deve ser especificada e projetada.</w:t>
+        <w:t>Adicionalmente, o sistema XXX pode ser alvo de ataques de “hackers” para roubar ou simplesmente corromper informações, possibilidade aumentada pela interface do sistema disponível na Internet, para evitar que tais ataques sejam bem sucedidos uma infra-estrutura de segurança deve ser especificada e projetada.</w:t>
       </w:r>
     </w:p>
     <w:p>
@@ -6535,15 +5875,7 @@
         <w:jc w:val="both"/>
       </w:pPr>
       <w:r>
-        <w:t xml:space="preserve">Os prazos podem ser dados em semanas ou meses dentro do projeto ou </w:t>
-      </w:r>
-      <w:proofErr w:type="spellStart"/>
-      <w:r>
-        <w:t>ate</w:t>
-      </w:r>
-      <w:proofErr w:type="spellEnd"/>
-      <w:r>
-        <w:t xml:space="preserve"> mesmo data.</w:t>
+        <w:t>Os prazos podem ser dados em semanas ou meses dentro do projeto ou ate mesmo data.</w:t>
       </w:r>
     </w:p>
     <w:p>
@@ -6980,13 +6312,8 @@
         <w:ind w:firstLine="540"/>
         <w:jc w:val="both"/>
       </w:pPr>
-      <w:proofErr w:type="spellStart"/>
-      <w:r>
-        <w:t>Obs</w:t>
-      </w:r>
-      <w:proofErr w:type="spellEnd"/>
-      <w:r>
-        <w:t>: Os prazos apresentados são uma estimativa inicial considerando as informações disponíveis nesta etapa do projeto. Um cronograma detalhado será elaborado na fase de planejamento e, eventualmente, estes prazos podem ser modificados.</w:t>
+      <w:r>
+        <w:t>Obs: Os prazos apresentados são uma estimativa inicial considerando as informações disponíveis nesta etapa do projeto. Um cronograma detalhado será elaborado na fase de planejamento e, eventualmente, estes prazos podem ser modificados.</w:t>
       </w:r>
     </w:p>
     <w:p>
@@ -7060,55 +6387,7 @@
           <w:sz w:val="18"/>
           <w:szCs w:val="18"/>
         </w:rPr>
-        <w:t xml:space="preserve">RUP. </w:t>
-      </w:r>
-      <w:proofErr w:type="spellStart"/>
-      <w:r>
-        <w:rPr>
-          <w:sz w:val="18"/>
-          <w:szCs w:val="18"/>
-        </w:rPr>
-        <w:t>Rational</w:t>
-      </w:r>
-      <w:proofErr w:type="spellEnd"/>
-      <w:r>
-        <w:rPr>
-          <w:sz w:val="18"/>
-          <w:szCs w:val="18"/>
-        </w:rPr>
-        <w:t xml:space="preserve"> </w:t>
-      </w:r>
-      <w:proofErr w:type="spellStart"/>
-      <w:r>
-        <w:rPr>
-          <w:sz w:val="18"/>
-          <w:szCs w:val="18"/>
-        </w:rPr>
-        <w:t>Unified</w:t>
-      </w:r>
-      <w:proofErr w:type="spellEnd"/>
-      <w:r>
-        <w:rPr>
-          <w:sz w:val="18"/>
-          <w:szCs w:val="18"/>
-        </w:rPr>
-        <w:t xml:space="preserve"> </w:t>
-      </w:r>
-      <w:proofErr w:type="spellStart"/>
-      <w:r>
-        <w:rPr>
-          <w:sz w:val="18"/>
-          <w:szCs w:val="18"/>
-        </w:rPr>
-        <w:t>Process</w:t>
-      </w:r>
-      <w:proofErr w:type="spellEnd"/>
-      <w:r>
-        <w:rPr>
-          <w:sz w:val="18"/>
-          <w:szCs w:val="18"/>
-        </w:rPr>
-        <w:t xml:space="preserve">. </w:t>
+        <w:t xml:space="preserve">RUP. Rational Unified Process. </w:t>
       </w:r>
     </w:p>
     <w:p>
@@ -8466,31 +7745,13 @@
               <w:lang w:val="en-US"/>
             </w:rPr>
           </w:pPr>
-          <w:proofErr w:type="spellStart"/>
           <w:r>
             <w:rPr>
               <w:sz w:val="16"/>
               <w:lang w:val="en-US"/>
             </w:rPr>
-            <w:t>Subtítulo</w:t>
+            <w:t>Subtítulo do Documento</w:t>
           </w:r>
-          <w:proofErr w:type="spellEnd"/>
-          <w:r>
-            <w:rPr>
-              <w:sz w:val="16"/>
-              <w:lang w:val="en-US"/>
-            </w:rPr>
-            <w:t xml:space="preserve"> do </w:t>
-          </w:r>
-          <w:proofErr w:type="spellStart"/>
-          <w:r>
-            <w:rPr>
-              <w:sz w:val="16"/>
-              <w:lang w:val="en-US"/>
-            </w:rPr>
-            <w:t>Documento</w:t>
-          </w:r>
-          <w:proofErr w:type="spellEnd"/>
         </w:p>
       </w:tc>
     </w:tr>
@@ -11741,6 +11002,7 @@
   <w:style w:type="character" w:default="1" w:styleId="Fontepargpadro">
     <w:name w:val="Default Paragraph Font"/>
     <w:uiPriority w:val="1"/>
+    <w:semiHidden/>
     <w:unhideWhenUsed/>
   </w:style>
   <w:style w:type="table" w:default="1" w:styleId="Tabelanormal">
@@ -12895,10 +12157,6 @@
 </file>
 
 <file path=customXml/item1.xml><?xml version="1.0" encoding="utf-8"?>
-<b:Sources xmlns:b="http://schemas.openxmlformats.org/officeDocument/2006/bibliography" xmlns="http://schemas.openxmlformats.org/officeDocument/2006/bibliography" SelectedStyle="\APA.XSL" StyleName="APA"/>
-</file>
-
-<file path=customXml/item2.xml><?xml version="1.0" encoding="utf-8"?>
 <?mso-contentType ?>
 <FormTemplates xmlns="http://schemas.microsoft.com/sharepoint/v3/contenttype/forms">
   <Display>DocumentLibraryForm</Display>
@@ -12907,10 +12165,27 @@
 </FormTemplates>
 </file>
 
+<file path=customXml/item2.xml><?xml version="1.0" encoding="utf-8"?>
+<b:Sources xmlns:b="http://schemas.openxmlformats.org/officeDocument/2006/bibliography" xmlns="http://schemas.openxmlformats.org/officeDocument/2006/bibliography" SelectedStyle="\APA.XSL" StyleName="APA"/>
+</file>
+
 <file path=customXml/item3.xml><?xml version="1.0" encoding="utf-8"?>
-<ct:contentTypeSchema xmlns:ct="http://schemas.microsoft.com/office/2006/metadata/contentType" xmlns:ma="http://schemas.microsoft.com/office/2006/metadata/properties/metaAttributes" ct:_="" ma:_="" ma:contentTypeName="Documento" ma:contentTypeID="0x010100E8B280B985D9DB43BC50B3BF3E94E2CD" ma:contentTypeVersion="4" ma:contentTypeDescription="Crie um novo documento." ma:contentTypeScope="" ma:versionID="553e54f753a374edcf8e6f42d3418d12">
-  <xsd:schema xmlns:xsd="http://www.w3.org/2001/XMLSchema" xmlns:xs="http://www.w3.org/2001/XMLSchema" xmlns:p="http://schemas.microsoft.com/office/2006/metadata/properties" xmlns:ns2="117662fa-4b96-46af-9f44-529280e9e8cf" targetNamespace="http://schemas.microsoft.com/office/2006/metadata/properties" ma:root="true" ma:fieldsID="b6f2890b5377a9aad4aa82b7032f8e48" ns2:_="">
-    <xsd:import namespace="117662fa-4b96-46af-9f44-529280e9e8cf"/>
+<p:properties xmlns:p="http://schemas.microsoft.com/office/2006/metadata/properties" xmlns:xsi="http://www.w3.org/2001/XMLSchema-instance" xmlns:pc="http://schemas.microsoft.com/office/infopath/2007/PartnerControls">
+  <documentManagement>
+    <ReferenceId xmlns="822b32be-aaf7-49f7-a363-a4efec114815" xsi:nil="true"/>
+    <lcf76f155ced4ddcb4097134ff3c332f xmlns="822b32be-aaf7-49f7-a363-a4efec114815">
+      <Terms xmlns="http://schemas.microsoft.com/office/infopath/2007/PartnerControls"/>
+    </lcf76f155ced4ddcb4097134ff3c332f>
+    <TaxCatchAll xmlns="e895cf24-b169-4322-98a1-bec75bee96c9" xsi:nil="true"/>
+  </documentManagement>
+</p:properties>
+</file>
+
+<file path=customXml/item4.xml><?xml version="1.0" encoding="utf-8"?>
+<ct:contentTypeSchema xmlns:ct="http://schemas.microsoft.com/office/2006/metadata/contentType" xmlns:ma="http://schemas.microsoft.com/office/2006/metadata/properties/metaAttributes" ct:_="" ma:_="" ma:contentTypeName="Documento" ma:contentTypeID="0x010100F5F4074597C3CE4E81F253EDE9073F3D" ma:contentTypeVersion="12" ma:contentTypeDescription="Crie um novo documento." ma:contentTypeScope="" ma:versionID="c4fa31801539f9500cdaae8dcf8dc4b7">
+  <xsd:schema xmlns:xsd="http://www.w3.org/2001/XMLSchema" xmlns:xs="http://www.w3.org/2001/XMLSchema" xmlns:p="http://schemas.microsoft.com/office/2006/metadata/properties" xmlns:ns2="822b32be-aaf7-49f7-a363-a4efec114815" xmlns:ns3="e895cf24-b169-4322-98a1-bec75bee96c9" targetNamespace="http://schemas.microsoft.com/office/2006/metadata/properties" ma:root="true" ma:fieldsID="ef887e338a775ce0dbc67618dfdd470a" ns2:_="" ns3:_="">
+    <xsd:import namespace="822b32be-aaf7-49f7-a363-a4efec114815"/>
+    <xsd:import namespace="e895cf24-b169-4322-98a1-bec75bee96c9"/>
     <xsd:element name="properties">
       <xsd:complexType>
         <xsd:sequence>
@@ -12921,6 +12196,13 @@
                 <xsd:element ref="ns2:MediaServiceMetadata" minOccurs="0"/>
                 <xsd:element ref="ns2:MediaServiceFastMetadata" minOccurs="0"/>
                 <xsd:element ref="ns2:MediaServiceSearchProperties" minOccurs="0"/>
+                <xsd:element ref="ns2:MediaServiceDateTaken" minOccurs="0"/>
+                <xsd:element ref="ns2:MediaServiceGenerationTime" minOccurs="0"/>
+                <xsd:element ref="ns2:MediaServiceEventHashCode" minOccurs="0"/>
+                <xsd:element ref="ns2:MediaLengthInSeconds" minOccurs="0"/>
+                <xsd:element ref="ns2:lcf76f155ced4ddcb4097134ff3c332f" minOccurs="0"/>
+                <xsd:element ref="ns3:TaxCatchAll" minOccurs="0"/>
+                <xsd:element ref="ns2:MediaServiceOCR" minOccurs="0"/>
               </xsd:all>
             </xsd:complexType>
           </xsd:element>
@@ -12928,7 +12210,7 @@
       </xsd:complexType>
     </xsd:element>
   </xsd:schema>
-  <xsd:schema xmlns:xsd="http://www.w3.org/2001/XMLSchema" xmlns:xs="http://www.w3.org/2001/XMLSchema" xmlns:dms="http://schemas.microsoft.com/office/2006/documentManagement/types" xmlns:pc="http://schemas.microsoft.com/office/infopath/2007/PartnerControls" targetNamespace="117662fa-4b96-46af-9f44-529280e9e8cf" elementFormDefault="qualified">
+  <xsd:schema xmlns:xsd="http://www.w3.org/2001/XMLSchema" xmlns:xs="http://www.w3.org/2001/XMLSchema" xmlns:dms="http://schemas.microsoft.com/office/2006/documentManagement/types" xmlns:pc="http://schemas.microsoft.com/office/infopath/2007/PartnerControls" targetNamespace="822b32be-aaf7-49f7-a363-a4efec114815" elementFormDefault="qualified">
     <xsd:import namespace="http://schemas.microsoft.com/office/2006/documentManagement/types"/>
     <xsd:import namespace="http://schemas.microsoft.com/office/infopath/2007/PartnerControls"/>
     <xsd:element name="ReferenceId" ma:index="8" nillable="true" ma:displayName="ReferenceId" ma:indexed="true" ma:internalName="ReferenceId">
@@ -12950,6 +12232,55 @@
       <xsd:simpleType>
         <xsd:restriction base="dms:Note"/>
       </xsd:simpleType>
+    </xsd:element>
+    <xsd:element name="MediaServiceDateTaken" ma:index="12" nillable="true" ma:displayName="MediaServiceDateTaken" ma:hidden="true" ma:indexed="true" ma:internalName="MediaServiceDateTaken" ma:readOnly="true">
+      <xsd:simpleType>
+        <xsd:restriction base="dms:Text"/>
+      </xsd:simpleType>
+    </xsd:element>
+    <xsd:element name="MediaServiceGenerationTime" ma:index="13" nillable="true" ma:displayName="MediaServiceGenerationTime" ma:hidden="true" ma:internalName="MediaServiceGenerationTime" ma:readOnly="true">
+      <xsd:simpleType>
+        <xsd:restriction base="dms:Text"/>
+      </xsd:simpleType>
+    </xsd:element>
+    <xsd:element name="MediaServiceEventHashCode" ma:index="14" nillable="true" ma:displayName="MediaServiceEventHashCode" ma:hidden="true" ma:internalName="MediaServiceEventHashCode" ma:readOnly="true">
+      <xsd:simpleType>
+        <xsd:restriction base="dms:Text"/>
+      </xsd:simpleType>
+    </xsd:element>
+    <xsd:element name="MediaLengthInSeconds" ma:index="15" nillable="true" ma:displayName="MediaLengthInSeconds" ma:hidden="true" ma:internalName="MediaLengthInSeconds" ma:readOnly="true">
+      <xsd:simpleType>
+        <xsd:restriction base="dms:Unknown"/>
+      </xsd:simpleType>
+    </xsd:element>
+    <xsd:element name="lcf76f155ced4ddcb4097134ff3c332f" ma:index="17" nillable="true" ma:taxonomy="true" ma:internalName="lcf76f155ced4ddcb4097134ff3c332f" ma:taxonomyFieldName="MediaServiceImageTags" ma:displayName="Marcações de imagem" ma:readOnly="false" ma:fieldId="{5cf76f15-5ced-4ddc-b409-7134ff3c332f}" ma:taxonomyMulti="true" ma:sspId="0ef6089c-5148-4909-88ac-65974e5b7eb0" ma:termSetId="09814cd3-568e-fe90-9814-8d621ff8fb84" ma:anchorId="fba54fb3-c3e1-fe81-a776-ca4b69148c4d" ma:open="true" ma:isKeyword="false">
+      <xsd:complexType>
+        <xsd:sequence>
+          <xsd:element ref="pc:Terms" minOccurs="0" maxOccurs="1"/>
+        </xsd:sequence>
+      </xsd:complexType>
+    </xsd:element>
+    <xsd:element name="MediaServiceOCR" ma:index="19" nillable="true" ma:displayName="Extracted Text" ma:internalName="MediaServiceOCR" ma:readOnly="true">
+      <xsd:simpleType>
+        <xsd:restriction base="dms:Note">
+          <xsd:maxLength value="255"/>
+        </xsd:restriction>
+      </xsd:simpleType>
+    </xsd:element>
+  </xsd:schema>
+  <xsd:schema xmlns:xsd="http://www.w3.org/2001/XMLSchema" xmlns:xs="http://www.w3.org/2001/XMLSchema" xmlns:dms="http://schemas.microsoft.com/office/2006/documentManagement/types" xmlns:pc="http://schemas.microsoft.com/office/infopath/2007/PartnerControls" targetNamespace="e895cf24-b169-4322-98a1-bec75bee96c9" elementFormDefault="qualified">
+    <xsd:import namespace="http://schemas.microsoft.com/office/2006/documentManagement/types"/>
+    <xsd:import namespace="http://schemas.microsoft.com/office/infopath/2007/PartnerControls"/>
+    <xsd:element name="TaxCatchAll" ma:index="18" nillable="true" ma:displayName="Taxonomy Catch All Column" ma:hidden="true" ma:list="{22f7c7c5-12e2-4b22-ae8b-33ec393ca4cf}" ma:internalName="TaxCatchAll" ma:showField="CatchAllData" ma:web="e895cf24-b169-4322-98a1-bec75bee96c9">
+      <xsd:complexType>
+        <xsd:complexContent>
+          <xsd:extension base="dms:MultiChoiceLookup">
+            <xsd:sequence>
+              <xsd:element name="Value" type="dms:Lookup" maxOccurs="unbounded" minOccurs="0" nillable="true"/>
+            </xsd:sequence>
+          </xsd:extension>
+        </xsd:complexContent>
+      </xsd:complexType>
     </xsd:element>
   </xsd:schema>
   <xsd:schema xmlns="http://schemas.openxmlformats.org/package/2006/metadata/core-properties" xmlns:xsd="http://www.w3.org/2001/XMLSchema" xmlns:xsi="http://www.w3.org/2001/XMLSchema-instance" xmlns:dc="http://purl.org/dc/elements/1.1/" xmlns:dcterms="http://purl.org/dc/terms/" xmlns:odoc="http://schemas.microsoft.com/internal/obd" targetNamespace="http://schemas.openxmlformats.org/package/2006/metadata/core-properties" elementFormDefault="qualified" attributeFormDefault="unqualified" blockDefault="#all">
@@ -13051,15 +12382,15 @@
 </ct:contentTypeSchema>
 </file>
 
-<file path=customXml/item4.xml><?xml version="1.0" encoding="utf-8"?>
-<p:properties xmlns:p="http://schemas.microsoft.com/office/2006/metadata/properties" xmlns:xsi="http://www.w3.org/2001/XMLSchema-instance" xmlns:pc="http://schemas.microsoft.com/office/infopath/2007/PartnerControls">
-  <documentManagement>
-    <ReferenceId xmlns="117662fa-4b96-46af-9f44-529280e9e8cf" xsi:nil="true"/>
-  </documentManagement>
-</p:properties>
+<file path=customXml/itemProps1.xml><?xml version="1.0" encoding="utf-8"?>
+<ds:datastoreItem xmlns:ds="http://schemas.openxmlformats.org/officeDocument/2006/customXml" ds:itemID="{40C0AABD-C8D6-4A6E-A9B6-E985E961591A}">
+  <ds:schemaRefs>
+    <ds:schemaRef ds:uri="http://schemas.microsoft.com/sharepoint/v3/contenttype/forms"/>
+  </ds:schemaRefs>
+</ds:datastoreItem>
 </file>
 
-<file path=customXml/itemProps1.xml><?xml version="1.0" encoding="utf-8"?>
+<file path=customXml/itemProps2.xml><?xml version="1.0" encoding="utf-8"?>
 <ds:datastoreItem xmlns:ds="http://schemas.openxmlformats.org/officeDocument/2006/customXml" ds:itemID="{E888FA76-4361-47A3-9E1F-E2C529BBBE0A}">
   <ds:schemaRefs>
     <ds:schemaRef ds:uri="http://schemas.openxmlformats.org/officeDocument/2006/bibliography"/>
@@ -13067,22 +12398,26 @@
 </ds:datastoreItem>
 </file>
 
-<file path=customXml/itemProps2.xml><?xml version="1.0" encoding="utf-8"?>
-<ds:datastoreItem xmlns:ds="http://schemas.openxmlformats.org/officeDocument/2006/customXml" ds:itemID="{40C0AABD-C8D6-4A6E-A9B6-E985E961591A}">
+<file path=customXml/itemProps3.xml><?xml version="1.0" encoding="utf-8"?>
+<ds:datastoreItem xmlns:ds="http://schemas.openxmlformats.org/officeDocument/2006/customXml" ds:itemID="{0B56267A-ECB7-4C16-BE3E-6D013007CA8F}">
   <ds:schemaRefs>
-    <ds:schemaRef ds:uri="http://schemas.microsoft.com/sharepoint/v3/contenttype/forms"/>
+    <ds:schemaRef ds:uri="http://schemas.microsoft.com/office/2006/metadata/properties"/>
+    <ds:schemaRef ds:uri="http://schemas.microsoft.com/office/infopath/2007/PartnerControls"/>
+    <ds:schemaRef ds:uri="822b32be-aaf7-49f7-a363-a4efec114815"/>
+    <ds:schemaRef ds:uri="e895cf24-b169-4322-98a1-bec75bee96c9"/>
   </ds:schemaRefs>
 </ds:datastoreItem>
 </file>
 
-<file path=customXml/itemProps3.xml><?xml version="1.0" encoding="utf-8"?>
-<ds:datastoreItem xmlns:ds="http://schemas.openxmlformats.org/officeDocument/2006/customXml" ds:itemID="{F01F78EE-83A7-47BE-B976-44D192049A1D}">
+<file path=customXml/itemProps4.xml><?xml version="1.0" encoding="utf-8"?>
+<ds:datastoreItem xmlns:ds="http://schemas.openxmlformats.org/officeDocument/2006/customXml" ds:itemID="{7F1ACE2F-01FB-4813-9358-848766857763}">
   <ds:schemaRefs>
     <ds:schemaRef ds:uri="http://schemas.microsoft.com/office/2006/metadata/contentType"/>
     <ds:schemaRef ds:uri="http://schemas.microsoft.com/office/2006/metadata/properties/metaAttributes"/>
     <ds:schemaRef ds:uri="http://www.w3.org/2001/XMLSchema"/>
     <ds:schemaRef ds:uri="http://schemas.microsoft.com/office/2006/metadata/properties"/>
-    <ds:schemaRef ds:uri="117662fa-4b96-46af-9f44-529280e9e8cf"/>
+    <ds:schemaRef ds:uri="822b32be-aaf7-49f7-a363-a4efec114815"/>
+    <ds:schemaRef ds:uri="e895cf24-b169-4322-98a1-bec75bee96c9"/>
     <ds:schemaRef ds:uri="http://schemas.microsoft.com/office/2006/documentManagement/types"/>
     <ds:schemaRef ds:uri="http://schemas.microsoft.com/office/infopath/2007/PartnerControls"/>
     <ds:schemaRef ds:uri="http://schemas.openxmlformats.org/package/2006/metadata/core-properties"/>
@@ -13091,14 +12426,4 @@
     <ds:schemaRef ds:uri="http://schemas.microsoft.com/internal/obd"/>
   </ds:schemaRefs>
 </ds:datastoreItem>
-</file>
-
-<file path=customXml/itemProps4.xml><?xml version="1.0" encoding="utf-8"?>
-<ds:datastoreItem xmlns:ds="http://schemas.openxmlformats.org/officeDocument/2006/customXml" ds:itemID="{0B56267A-ECB7-4C16-BE3E-6D013007CA8F}">
-  <ds:schemaRefs>
-    <ds:schemaRef ds:uri="http://schemas.microsoft.com/office/2006/metadata/properties"/>
-    <ds:schemaRef ds:uri="http://schemas.microsoft.com/office/infopath/2007/PartnerControls"/>
-    <ds:schemaRef ds:uri="117662fa-4b96-46af-9f44-529280e9e8cf"/>
-  </ds:schemaRefs>
-</ds:datastoreItem>
 </file>
</xml_diff>